<commit_message>
feat: Comprehensive bug fixes, CSV reporting, and advanced Heatmap UI updates
</commit_message>
<xml_diff>
--- a/Documents/Mansakha_Commit_Ledger.docx
+++ b/Documents/Mansakha_Commit_Ledger.docx
@@ -1867,6 +1867,133 @@
       </w:pPr>
       <w:r>
         <w:t xml:space="preserve">The Create Account / Cancel toggle button kept its "add person" icon even while reading "Cancel" - swapped to an X icon in that state</w:t>
+      </w:r>
+    </w:p>
+    <w:p>
+      <w:r>
+        <w:rPr>
+          <w:rFonts w:ascii="Consolas" w:hAnsi="Consolas"/>
+          <w:b/>
+          <w:sz w:val="22"/>
+        </w:rPr>
+        <w:t>9658d79</w:t>
+      </w:r>
+    </w:p>
+    <w:p>
+      <w:r>
+        <w:rPr>
+          <w:i/>
+          <w:sz w:val="22"/>
+        </w:rPr>
+        <w:t>Fix dashboard/heatmap perf and field-name bugs, add comparison graphs, seed test data</w:t>
+      </w:r>
+    </w:p>
+    <w:p>
+      <w:pPr>
+        <w:pStyle w:val="ListParagraph"/>
+        <w:numPr>
+          <w:ilvl w:val="0"/>
+          <w:numId w:val="1"/>
+        </w:numPr>
+      </w:pPr>
+      <w:r>
+        <w:t>Ministry, State Admin, and National Admin dashboards and the Heatmap page were reading response fields the backend didn't actually send, so their totals and breakdown tables had been silently blank</w:t>
+      </w:r>
+    </w:p>
+    <w:p>
+      <w:pPr>
+        <w:pStyle w:val="ListParagraph"/>
+        <w:numPr>
+          <w:ilvl w:val="0"/>
+          <w:numId w:val="1"/>
+        </w:numPr>
+      </w:pPr>
+      <w:r>
+        <w:t>Cut the National/State dashboard load time from 30-40 seconds to about 10 seconds - the per-state queries ran one after another and went through the Supabase REST API; now they run in parallel over a direct Postgres connection</w:t>
+      </w:r>
+    </w:p>
+    <w:p>
+      <w:pPr>
+        <w:pStyle w:val="ListParagraph"/>
+        <w:numPr>
+          <w:ilvl w:val="0"/>
+          <w:numId w:val="1"/>
+        </w:numPr>
+      </w:pPr>
+      <w:r>
+        <w:t>Added ranked bar and donut comparison graphs (cases by district/state, risk-level breakdown) for Ministry, State Admin, and National Admin</w:t>
+      </w:r>
+    </w:p>
+    <w:p>
+      <w:pPr>
+        <w:pStyle w:val="ListParagraph"/>
+        <w:numPr>
+          <w:ilvl w:val="0"/>
+          <w:numId w:val="1"/>
+        </w:numPr>
+      </w:pPr>
+      <w:r>
+        <w:t>Fixed the sidebar so Log Out stays pinned at the bottom without the whole page scrolling when the nav list is too tall for one screen</w:t>
+      </w:r>
+    </w:p>
+    <w:p>
+      <w:pPr>
+        <w:pStyle w:val="ListParagraph"/>
+        <w:numPr>
+          <w:ilvl w:val="0"/>
+          <w:numId w:val="1"/>
+        </w:numPr>
+      </w:pPr>
+      <w:r>
+        <w:t>Fixed the Victim Login screen's card not centering on tablet/desktop widths</w:t>
+      </w:r>
+    </w:p>
+    <w:p>
+      <w:pPr>
+        <w:pStyle w:val="ListParagraph"/>
+        <w:numPr>
+          <w:ilvl w:val="0"/>
+          <w:numId w:val="1"/>
+        </w:numPr>
+      </w:pPr>
+      <w:r>
+        <w:t>Added a Ministry Profile page, which hadn't existed before</w:t>
+      </w:r>
+    </w:p>
+    <w:p>
+      <w:pPr>
+        <w:pStyle w:val="ListParagraph"/>
+        <w:numPr>
+          <w:ilvl w:val="0"/>
+          <w:numId w:val="1"/>
+        </w:numPr>
+      </w:pPr>
+      <w:r>
+        <w:t>Removed the Gemini Analytics widget from the Ministry Dashboard, per request</w:t>
+      </w:r>
+    </w:p>
+    <w:p>
+      <w:pPr>
+        <w:pStyle w:val="ListParagraph"/>
+        <w:numPr>
+          <w:ilvl w:val="0"/>
+          <w:numId w:val="1"/>
+        </w:numPr>
+      </w:pPr>
+      <w:r>
+        <w:t>Repeated identical toast notifications now replace each other instead of stacking into a wall of duplicates</w:t>
+      </w:r>
+    </w:p>
+    <w:p>
+      <w:pPr>
+        <w:pStyle w:val="ListParagraph"/>
+        <w:numPr>
+          <w:ilvl w:val="0"/>
+          <w:numId w:val="1"/>
+        </w:numPr>
+      </w:pPr>
+      <w:r>
+        <w:t>Seeded 500 test victims and 50 counsellors across states for QA testing</w:t>
       </w:r>
     </w:p>
     <w:p>

</xml_diff>